<commit_message>
updated summary document with names and link to repository
</commit_message>
<xml_diff>
--- a/results/reports/report.docx
+++ b/results/reports/report.docx
@@ -4,16 +4,305 @@
   <w:body>
     <w:p>
       <w:pPr>
-        <w:rPr>
-          <w:lang w:val="it-IT"/>
+        <w:jc w:val="center"/>
+        <w:rPr>
+          <w:b/>
+          <w:bCs/>
+          <w:sz w:val="48"/>
+          <w:szCs w:val="48"/>
+          <w:lang w:val="en-US"/>
         </w:rPr>
       </w:pPr>
       <w:r>
         <w:rPr>
-          <w:lang w:val="it-IT"/>
-        </w:rPr>
-        <w:t>New file for report</w:t>
-      </w:r>
+          <w:b/>
+          <w:bCs/>
+          <w:sz w:val="48"/>
+          <w:szCs w:val="48"/>
+          <w:lang w:val="en-US"/>
+        </w:rPr>
+        <w:t xml:space="preserve">Summary - Group </w:t>
+      </w:r>
+      <w:r>
+        <w:rPr>
+          <w:b/>
+          <w:bCs/>
+          <w:sz w:val="48"/>
+          <w:szCs w:val="48"/>
+          <w:lang w:val="en-US"/>
+        </w:rPr>
+        <w:t>F</w:t>
+      </w:r>
+    </w:p>
+    <w:p>
+      <w:pPr>
+        <w:pStyle w:val="Heading1"/>
+        <w:rPr>
+          <w:lang w:val="en-US"/>
+        </w:rPr>
+      </w:pPr>
+      <w:r>
+        <w:rPr>
+          <w:lang w:val="en-US"/>
+        </w:rPr>
+        <w:t>Who, what, and where?</w:t>
+      </w:r>
+    </w:p>
+    <w:p>
+      <w:pPr>
+        <w:rPr>
+          <w:sz w:val="22"/>
+          <w:szCs w:val="22"/>
+          <w:lang w:val="en-US"/>
+        </w:rPr>
+      </w:pPr>
+      <w:r>
+        <w:rPr>
+          <w:b/>
+          <w:bCs/>
+          <w:sz w:val="22"/>
+          <w:szCs w:val="22"/>
+          <w:lang w:val="en-US"/>
+        </w:rPr>
+        <w:t xml:space="preserve">ITU-name and </w:t>
+      </w:r>
+      <w:r>
+        <w:rPr>
+          <w:b/>
+          <w:bCs/>
+          <w:sz w:val="22"/>
+          <w:szCs w:val="22"/>
+          <w:lang w:val="en-US"/>
+        </w:rPr>
+        <w:t>(</w:t>
+      </w:r>
+      <w:r>
+        <w:rPr>
+          <w:b/>
+          <w:bCs/>
+          <w:sz w:val="22"/>
+          <w:szCs w:val="22"/>
+          <w:lang w:val="en-US"/>
+        </w:rPr>
+        <w:t>Git</w:t>
+      </w:r>
+      <w:r>
+        <w:rPr>
+          <w:b/>
+          <w:bCs/>
+          <w:sz w:val="22"/>
+          <w:szCs w:val="22"/>
+          <w:lang w:val="en-US"/>
+        </w:rPr>
+        <w:t>H</w:t>
+      </w:r>
+      <w:r>
+        <w:rPr>
+          <w:b/>
+          <w:bCs/>
+          <w:sz w:val="22"/>
+          <w:szCs w:val="22"/>
+          <w:lang w:val="en-US"/>
+        </w:rPr>
+        <w:t>ub-name</w:t>
+      </w:r>
+      <w:r>
+        <w:rPr>
+          <w:b/>
+          <w:bCs/>
+          <w:sz w:val="22"/>
+          <w:szCs w:val="22"/>
+          <w:lang w:val="en-US"/>
+        </w:rPr>
+        <w:t>)</w:t>
+      </w:r>
+      <w:r>
+        <w:rPr>
+          <w:b/>
+          <w:bCs/>
+          <w:sz w:val="22"/>
+          <w:szCs w:val="22"/>
+          <w:lang w:val="en-US"/>
+        </w:rPr>
+        <w:t>:</w:t>
+      </w:r>
+      <w:r>
+        <w:rPr>
+          <w:sz w:val="22"/>
+          <w:szCs w:val="22"/>
+          <w:lang w:val="en-US"/>
+        </w:rPr>
+        <w:t xml:space="preserve"> Julius</w:t>
+      </w:r>
+      <w:r>
+        <w:rPr>
+          <w:sz w:val="22"/>
+          <w:szCs w:val="22"/>
+          <w:lang w:val="en-US"/>
+        </w:rPr>
+        <w:t xml:space="preserve"> Kerff Michelsen (</w:t>
+      </w:r>
+      <w:proofErr w:type="spellStart"/>
+      <w:r>
+        <w:rPr>
+          <w:sz w:val="22"/>
+          <w:szCs w:val="22"/>
+          <w:lang w:val="en-US"/>
+        </w:rPr>
+        <w:t>JuliusMichelsen</w:t>
+      </w:r>
+      <w:proofErr w:type="spellEnd"/>
+      <w:r>
+        <w:rPr>
+          <w:sz w:val="22"/>
+          <w:szCs w:val="22"/>
+          <w:lang w:val="en-US"/>
+        </w:rPr>
+        <w:t>), …</w:t>
+      </w:r>
+    </w:p>
+    <w:p>
+      <w:pPr>
+        <w:rPr>
+          <w:sz w:val="22"/>
+          <w:szCs w:val="22"/>
+          <w:lang w:val="en-US"/>
+        </w:rPr>
+      </w:pPr>
+      <w:proofErr w:type="gramStart"/>
+      <w:r>
+        <w:rPr>
+          <w:b/>
+          <w:bCs/>
+          <w:sz w:val="22"/>
+          <w:szCs w:val="22"/>
+          <w:lang w:val="en-US"/>
+        </w:rPr>
+        <w:t>Annotators(</w:t>
+      </w:r>
+      <w:proofErr w:type="gramEnd"/>
+      <w:r>
+        <w:rPr>
+          <w:b/>
+          <w:bCs/>
+          <w:sz w:val="22"/>
+          <w:szCs w:val="22"/>
+          <w:lang w:val="en-US"/>
+        </w:rPr>
+        <w:t>who is who in for the annotations):</w:t>
+      </w:r>
+      <w:r>
+        <w:rPr>
+          <w:sz w:val="22"/>
+          <w:szCs w:val="22"/>
+          <w:lang w:val="en-US"/>
+        </w:rPr>
+        <w:t xml:space="preserve"> Hafsa(h), Julius(j), Nikolay(n), Oscar James(</w:t>
+      </w:r>
+      <w:proofErr w:type="spellStart"/>
+      <w:r>
+        <w:rPr>
+          <w:sz w:val="22"/>
+          <w:szCs w:val="22"/>
+          <w:lang w:val="en-US"/>
+        </w:rPr>
+        <w:t>oj</w:t>
+      </w:r>
+      <w:proofErr w:type="spellEnd"/>
+      <w:r>
+        <w:rPr>
+          <w:sz w:val="22"/>
+          <w:szCs w:val="22"/>
+          <w:lang w:val="en-US"/>
+        </w:rPr>
+        <w:t>) and Valentina(v)</w:t>
+      </w:r>
+    </w:p>
+    <w:p>
+      <w:pPr>
+        <w:rPr>
+          <w:sz w:val="22"/>
+          <w:szCs w:val="22"/>
+          <w:lang w:val="en-US"/>
+        </w:rPr>
+      </w:pPr>
+      <w:r>
+        <w:rPr>
+          <w:sz w:val="22"/>
+          <w:szCs w:val="22"/>
+          <w:lang w:val="en-US"/>
+        </w:rPr>
+        <w:t xml:space="preserve">GitHub directory: </w:t>
+      </w:r>
+      <w:hyperlink r:id="rId4" w:history="1">
+        <w:r>
+          <w:rPr>
+            <w:rStyle w:val="Hyperlink"/>
+            <w:sz w:val="22"/>
+            <w:szCs w:val="22"/>
+            <w:lang w:val="en-US"/>
+          </w:rPr>
+          <w:t>https://github.com/Oscar-James/ProjectInDataScience2026_ExamTemplate_F.git</w:t>
+        </w:r>
+      </w:hyperlink>
+    </w:p>
+    <w:p>
+      <w:pPr>
+        <w:rPr>
+          <w:sz w:val="22"/>
+          <w:szCs w:val="22"/>
+          <w:lang w:val="en-US"/>
+        </w:rPr>
+      </w:pPr>
+    </w:p>
+    <w:p>
+      <w:pPr>
+        <w:rPr>
+          <w:sz w:val="22"/>
+          <w:szCs w:val="22"/>
+          <w:lang w:val="en-US"/>
+        </w:rPr>
+      </w:pPr>
+    </w:p>
+    <w:p>
+      <w:pPr>
+        <w:pStyle w:val="Heading1"/>
+        <w:rPr>
+          <w:lang w:val="en-US"/>
+        </w:rPr>
+      </w:pPr>
+      <w:r>
+        <w:rPr>
+          <w:lang w:val="en-US"/>
+        </w:rPr>
+        <w:t>Summary</w:t>
+      </w:r>
+    </w:p>
+    <w:p>
+      <w:pPr>
+        <w:rPr>
+          <w:sz w:val="22"/>
+          <w:szCs w:val="22"/>
+          <w:lang w:val="en-US"/>
+        </w:rPr>
+      </w:pPr>
+      <w:r>
+        <w:rPr>
+          <w:sz w:val="22"/>
+          <w:szCs w:val="22"/>
+          <w:lang w:val="en-US"/>
+        </w:rPr>
+        <w:t>(Summary coming here soon)</w:t>
+      </w:r>
+    </w:p>
+    <w:p>
+      <w:pPr>
+        <w:rPr>
+          <w:sz w:val="22"/>
+          <w:szCs w:val="22"/>
+          <w:lang w:val="en-US"/>
+        </w:rPr>
+      </w:pPr>
     </w:p>
     <w:sectPr>
       <w:pgSz w:w="11906" w:h="16838"/>
@@ -34,7 +323,7 @@
         <w:kern w:val="2"/>
         <w:sz w:val="24"/>
         <w:szCs w:val="24"/>
-        <w:lang w:val="en-IT" w:eastAsia="en-US" w:bidi="ar-SA"/>
+        <w:lang w:eastAsia="en-US" w:bidi="ar-SA"/>
         <w14:ligatures w14:val="standardContextual"/>
       </w:rPr>
     </w:rPrDefault>
@@ -425,6 +714,10 @@
   <w:style w:type="paragraph" w:default="1" w:styleId="Normal">
     <w:name w:val="Normal"/>
     <w:qFormat/>
+    <w:rsid w:val="00BE0E3F"/>
+    <w:rPr>
+      <w:rFonts w:ascii="Palatino Linotype" w:hAnsi="Palatino Linotype"/>
+    </w:rPr>
   </w:style>
   <w:style w:type="paragraph" w:styleId="Heading1">
     <w:name w:val="heading 1"/>
@@ -433,7 +726,7 @@
     <w:link w:val="Heading1Char"/>
     <w:uiPriority w:val="9"/>
     <w:qFormat/>
-    <w:rsid w:val="00142F6C"/>
+    <w:rsid w:val="00BE0E3F"/>
     <w:pPr>
       <w:keepNext/>
       <w:keepLines/>
@@ -441,7 +734,7 @@
       <w:outlineLvl w:val="0"/>
     </w:pPr>
     <w:rPr>
-      <w:rFonts w:asciiTheme="majorHAnsi" w:eastAsiaTheme="majorEastAsia" w:hAnsiTheme="majorHAnsi" w:cstheme="majorBidi"/>
+      <w:rFonts w:eastAsiaTheme="majorEastAsia" w:cstheme="majorBidi"/>
       <w:color w:val="0F4761" w:themeColor="accent1" w:themeShade="BF"/>
       <w:sz w:val="40"/>
       <w:szCs w:val="40"/>
@@ -453,10 +746,9 @@
     <w:next w:val="Normal"/>
     <w:link w:val="Heading2Char"/>
     <w:uiPriority w:val="9"/>
-    <w:semiHidden/>
     <w:unhideWhenUsed/>
     <w:qFormat/>
-    <w:rsid w:val="00142F6C"/>
+    <w:rsid w:val="00BE0E3F"/>
     <w:pPr>
       <w:keepNext/>
       <w:keepLines/>
@@ -464,9 +756,8 @@
       <w:outlineLvl w:val="1"/>
     </w:pPr>
     <w:rPr>
-      <w:rFonts w:asciiTheme="majorHAnsi" w:eastAsiaTheme="majorEastAsia" w:hAnsiTheme="majorHAnsi" w:cstheme="majorBidi"/>
-      <w:color w:val="0F4761" w:themeColor="accent1" w:themeShade="BF"/>
-      <w:sz w:val="32"/>
+      <w:rFonts w:eastAsiaTheme="majorEastAsia" w:cstheme="majorBidi"/>
+      <w:color w:val="000000" w:themeColor="text1"/>
       <w:szCs w:val="32"/>
     </w:rPr>
   </w:style>
@@ -657,9 +948,9 @@
     <w:basedOn w:val="DefaultParagraphFont"/>
     <w:link w:val="Heading1"/>
     <w:uiPriority w:val="9"/>
-    <w:rsid w:val="00142F6C"/>
-    <w:rPr>
-      <w:rFonts w:asciiTheme="majorHAnsi" w:eastAsiaTheme="majorEastAsia" w:hAnsiTheme="majorHAnsi" w:cstheme="majorBidi"/>
+    <w:rsid w:val="00BE0E3F"/>
+    <w:rPr>
+      <w:rFonts w:ascii="Palatino Linotype" w:eastAsiaTheme="majorEastAsia" w:hAnsi="Palatino Linotype" w:cstheme="majorBidi"/>
       <w:color w:val="0F4761" w:themeColor="accent1" w:themeShade="BF"/>
       <w:sz w:val="40"/>
       <w:szCs w:val="40"/>
@@ -670,12 +961,10 @@
     <w:basedOn w:val="DefaultParagraphFont"/>
     <w:link w:val="Heading2"/>
     <w:uiPriority w:val="9"/>
-    <w:semiHidden/>
-    <w:rsid w:val="00142F6C"/>
-    <w:rPr>
-      <w:rFonts w:asciiTheme="majorHAnsi" w:eastAsiaTheme="majorEastAsia" w:hAnsiTheme="majorHAnsi" w:cstheme="majorBidi"/>
-      <w:color w:val="0F4761" w:themeColor="accent1" w:themeShade="BF"/>
-      <w:sz w:val="32"/>
+    <w:rsid w:val="00BE0E3F"/>
+    <w:rPr>
+      <w:rFonts w:ascii="Palatino Linotype" w:eastAsiaTheme="majorEastAsia" w:hAnsi="Palatino Linotype" w:cstheme="majorBidi"/>
+      <w:color w:val="000000" w:themeColor="text1"/>
       <w:szCs w:val="32"/>
     </w:rPr>
   </w:style>
@@ -940,6 +1229,29 @@
       <w:smallCaps/>
       <w:color w:val="0F4761" w:themeColor="accent1" w:themeShade="BF"/>
       <w:spacing w:val="5"/>
+    </w:rPr>
+  </w:style>
+  <w:style w:type="character" w:styleId="Hyperlink">
+    <w:name w:val="Hyperlink"/>
+    <w:basedOn w:val="DefaultParagraphFont"/>
+    <w:uiPriority w:val="99"/>
+    <w:unhideWhenUsed/>
+    <w:rsid w:val="00BE0E3F"/>
+    <w:rPr>
+      <w:color w:val="467886" w:themeColor="hyperlink"/>
+      <w:u w:val="single"/>
+    </w:rPr>
+  </w:style>
+  <w:style w:type="character" w:styleId="UnresolvedMention">
+    <w:name w:val="Unresolved Mention"/>
+    <w:basedOn w:val="DefaultParagraphFont"/>
+    <w:uiPriority w:val="99"/>
+    <w:semiHidden/>
+    <w:unhideWhenUsed/>
+    <w:rsid w:val="00BE0E3F"/>
+    <w:rPr>
+      <w:color w:val="605E5C"/>
+      <w:shd w:val="clear" w:color="auto" w:fill="E1DFDD"/>
     </w:rPr>
   </w:style>
 </w:styles>

</xml_diff>